<commit_message>
Update CEO weekly report to include Mobile Team data
Added Section 2 – Mobile Outsourcing Team (글로벌아웃소싱):
- PPP Center: iPPP Business Play 4.0 (3 tasks: 2 Completed, 1 In Progress)
- WiBillPay Center: 2 tasks (both Completed)
Updated KPIs: 45 total tasks (25 In Progress, 13 Completed, 4 To Do, 3 Ongoing)

Co-Authored-By: Claude Sonnet 4.6 <noreply@anthropic.com>
</commit_message>
<xml_diff>
--- a/2026_03_23/CEO/Weekly_Report_2026_03_23_CEO.docx
+++ b/2026_03_23/CEO/Weekly_Report_2026_03_23_CEO.docx
@@ -5,7 +5,7 @@
     <w:p>
       <w:pPr>
         <w:shd w:fill="1F3864" w:val="clear"/>
-        <w:spacing w:after="80" w:before="0"/>
+        <w:spacing w:after="0" w:before="0"/>
         <w:jc w:val="center"/>
       </w:pPr>
       <w:r>
@@ -122,18 +122,16 @@
                 <w:sz w:val="56"/>
                 <w:szCs w:val="56"/>
               </w:rPr>
-              <w:t xml:space="preserve">40</w:t>
-            </w:r>
-          </w:p>
-          <w:p>
-            <w:pPr>
-              <w:jc w:val="center"/>
-            </w:pPr>
-            <w:r>
-              <w:rPr>
-                <w:rFonts w:ascii="Arial" w:cs="Arial" w:eastAsia="Arial" w:hAnsi="Arial"/>
-                <w:b w:val="false"/>
-                <w:bCs w:val="false"/>
+              <w:t xml:space="preserve">45</w:t>
+            </w:r>
+          </w:p>
+          <w:p>
+            <w:pPr>
+              <w:jc w:val="center"/>
+            </w:pPr>
+            <w:r>
+              <w:rPr>
+                <w:rFonts w:ascii="Arial" w:cs="Arial" w:eastAsia="Arial" w:hAnsi="Arial"/>
                 <w:color w:val="FFFFFF"/>
                 <w:sz w:val="20"/>
                 <w:szCs w:val="20"/>
@@ -173,18 +171,16 @@
                 <w:sz w:val="56"/>
                 <w:szCs w:val="56"/>
               </w:rPr>
-              <w:t xml:space="preserve">24</w:t>
-            </w:r>
-          </w:p>
-          <w:p>
-            <w:pPr>
-              <w:jc w:val="center"/>
-            </w:pPr>
-            <w:r>
-              <w:rPr>
-                <w:rFonts w:ascii="Arial" w:cs="Arial" w:eastAsia="Arial" w:hAnsi="Arial"/>
-                <w:b w:val="false"/>
-                <w:bCs w:val="false"/>
+              <w:t xml:space="preserve">25</w:t>
+            </w:r>
+          </w:p>
+          <w:p>
+            <w:pPr>
+              <w:jc w:val="center"/>
+            </w:pPr>
+            <w:r>
+              <w:rPr>
+                <w:rFonts w:ascii="Arial" w:cs="Arial" w:eastAsia="Arial" w:hAnsi="Arial"/>
                 <w:color w:val="7030A0"/>
                 <w:sz w:val="20"/>
                 <w:szCs w:val="20"/>
@@ -224,18 +220,16 @@
                 <w:sz w:val="56"/>
                 <w:szCs w:val="56"/>
               </w:rPr>
-              <w:t xml:space="preserve">9</w:t>
-            </w:r>
-          </w:p>
-          <w:p>
-            <w:pPr>
-              <w:jc w:val="center"/>
-            </w:pPr>
-            <w:r>
-              <w:rPr>
-                <w:rFonts w:ascii="Arial" w:cs="Arial" w:eastAsia="Arial" w:hAnsi="Arial"/>
-                <w:b w:val="false"/>
-                <w:bCs w:val="false"/>
+              <w:t xml:space="preserve">13</w:t>
+            </w:r>
+          </w:p>
+          <w:p>
+            <w:pPr>
+              <w:jc w:val="center"/>
+            </w:pPr>
+            <w:r>
+              <w:rPr>
+                <w:rFonts w:ascii="Arial" w:cs="Arial" w:eastAsia="Arial" w:hAnsi="Arial"/>
                 <w:color w:val="375623"/>
                 <w:sz w:val="20"/>
                 <w:szCs w:val="20"/>
@@ -285,8 +279,6 @@
             <w:r>
               <w:rPr>
                 <w:rFonts w:ascii="Arial" w:cs="Arial" w:eastAsia="Arial" w:hAnsi="Arial"/>
-                <w:b w:val="false"/>
-                <w:bCs w:val="false"/>
                 <w:color w:val="833C00"/>
                 <w:sz w:val="20"/>
                 <w:szCs w:val="20"/>
@@ -336,8 +328,6 @@
             <w:r>
               <w:rPr>
                 <w:rFonts w:ascii="Arial" w:cs="Arial" w:eastAsia="Arial" w:hAnsi="Arial"/>
-                <w:b w:val="false"/>
-                <w:bCs w:val="false"/>
                 <w:color w:val="1F3864"/>
                 <w:sz w:val="20"/>
                 <w:szCs w:val="20"/>
@@ -370,7 +360,7 @@
           <w:sz w:val="19"/>
           <w:szCs w:val="19"/>
         </w:rPr>
-        <w:t xml:space="preserve">This report covers weekly progress across the Business Team (Local Business Center) and Web Scraping Team (COOCON Outsourcing) for the week ending March 23, 2026. Key activities include ongoing MFI onboarding under WeBill365 LM, active client management under WeBill365 SM, WeLoan contract progress, and Q1 2026 development milestones for the COOCON outsourcing portfolio.</w:t>
+        <w:t xml:space="preserve">This report covers weekly progress across the Business Team (Local Business Center), Mobile Outsourcing Team (글로벌아웃소싱), Web Scraping Team (COOCON Outsourcing), and Scraping Team for the week ending March 23, 2026. Key activities include ongoing MFI onboarding under WeBill365 LM, active client management under WeBill365 SM, WeLoan contract progress, mobile app development milestones, and Q1 2026 development progress for COOCON outsourcing.</w:t>
       </w:r>
     </w:p>
     <w:p>
@@ -1154,7 +1144,7 @@
                 <w:sz w:val="17"/>
                 <w:szCs w:val="17"/>
               </w:rPr>
-              <w:t xml:space="preserve">Same milestone as Prime; parallel track</w:t>
+              <w:t xml:space="preserve">Parallel track with Prime; same milestones</w:t>
             </w:r>
           </w:p>
         </w:tc>
@@ -3153,7 +3143,7 @@
                 <w:sz w:val="17"/>
                 <w:szCs w:val="17"/>
               </w:rPr>
-              <w:t xml:space="preserve">Similar issue to SORM HUOT; tracked separately</w:t>
+              <w:t xml:space="preserve">Tracked separately; same issue category as SORM HUOT</w:t>
             </w:r>
           </w:p>
         </w:tc>
@@ -3913,7 +3903,7 @@
                 <w:sz w:val="17"/>
                 <w:szCs w:val="17"/>
               </w:rPr>
-              <w:t xml:space="preserve">High-volume printer; strong revenue contributor</w:t>
+              <w:t xml:space="preserve">High-volume; strong revenue contributor</w:t>
             </w:r>
           </w:p>
         </w:tc>
@@ -5807,7 +5797,7 @@
                 <w:sz w:val="17"/>
                 <w:szCs w:val="17"/>
               </w:rPr>
-              <w:t xml:space="preserve">SMS pricing confirmed: $0.08 domestic, $0.15 international, $0.01 platform group (50% discount)</w:t>
+              <w:t xml:space="preserve">SMS pricing confirmed: $0.08 domestic, $0.15 international, $0.01 platform group (50% off)</w:t>
             </w:r>
           </w:p>
         </w:tc>
@@ -9237,7 +9227,1906 @@
           <w:sz w:val="28"/>
           <w:szCs w:val="28"/>
         </w:rPr>
-        <w:t xml:space="preserve">2. Web Scraping Team – COOCON Outsourcing (Q1 2026 Progress)</w:t>
+        <w:t xml:space="preserve">2. Mobile Outsourcing Team (글로벌아웃소싱 – Global Outsourcing)</w:t>
+      </w:r>
+    </w:p>
+    <w:p>
+      <w:pPr>
+        <w:spacing w:after="80" w:before="0"/>
+        <w:jc w:val="left"/>
+      </w:pPr>
+      <w:r>
+        <w:rPr>
+          <w:rFonts w:ascii="Arial" w:cs="Arial" w:eastAsia="Arial" w:hAnsi="Arial"/>
+          <w:b w:val="false"/>
+          <w:bCs w:val="false"/>
+          <w:color w:val="595959"/>
+          <w:sz w:val="19"/>
+          <w:szCs w:val="19"/>
+        </w:rPr>
+        <w:t xml:space="preserve">The Mobile Outsourcing Dept. manages two product centers: the PPP Center On-Premise (iPPP Business Play 4.0) and the WiBillPay Center. Both Android and iOS versions are tracked per release build.</w:t>
+      </w:r>
+    </w:p>
+    <w:p>
+      <w:pPr>
+        <w:spacing w:after="100" w:before="180"/>
+      </w:pPr>
+      <w:r>
+        <w:rPr>
+          <w:rFonts w:ascii="Arial" w:cs="Arial" w:eastAsia="Arial" w:hAnsi="Arial"/>
+          <w:b/>
+          <w:bCs/>
+          <w:color w:val="2E5799"/>
+          <w:sz w:val="22"/>
+          <w:szCs w:val="22"/>
+        </w:rPr>
+        <w:t xml:space="preserve">2.1  PPP Center On-Premise – iPPP Business Play 4.0</w:t>
+      </w:r>
+    </w:p>
+    <w:p>
+      <w:pPr>
+        <w:spacing w:after="80" w:before="0"/>
+        <w:jc w:val="left"/>
+      </w:pPr>
+      <w:r>
+        <w:rPr>
+          <w:rFonts w:ascii="Arial" w:cs="Arial" w:eastAsia="Arial" w:hAnsi="Arial"/>
+          <w:b w:val="false"/>
+          <w:bCs w:val="false"/>
+          <w:color w:val="595959"/>
+          <w:sz w:val="18"/>
+          <w:szCs w:val="18"/>
+        </w:rPr>
+        <w:t xml:space="preserve">Clients: Lotte Central Research Institute (롯데중앙연구소), iThree (아이터리), POSCO ICT, POSTGRES, and others.</w:t>
+      </w:r>
+    </w:p>
+    <w:tbl>
+      <w:tblPr>
+        <w:tblW w:type="dxa" w:w="15398"/>
+        <w:tblBorders>
+          <w:top w:val="single" w:color="auto" w:sz="4"/>
+          <w:left w:val="single" w:color="auto" w:sz="4"/>
+          <w:bottom w:val="single" w:color="auto" w:sz="4"/>
+          <w:right w:val="single" w:color="auto" w:sz="4"/>
+          <w:insideH w:val="single" w:color="auto" w:sz="4"/>
+          <w:insideV w:val="single" w:color="auto" w:sz="4"/>
+        </w:tblBorders>
+      </w:tblPr>
+      <w:tblGrid>
+        <w:gridCol w:w="500"/>
+        <w:gridCol w:w="4200"/>
+        <w:gridCol w:w="2800"/>
+        <w:gridCol w:w="1300"/>
+        <w:gridCol w:w="1300"/>
+        <w:gridCol w:w="1700"/>
+        <w:gridCol w:w="3598"/>
+      </w:tblGrid>
+      <w:tr>
+        <w:trPr>
+          <w:tblHeader/>
+        </w:trPr>
+        <w:tc>
+          <w:tcPr>
+            <w:tcW w:type="dxa" w:w="500"/>
+            <w:gridSpan w:val="1"/>
+            <w:tcBorders>
+              <w:top w:val="single" w:color="1F3864" w:sz="6"/>
+              <w:left w:val="single" w:color="1F3864" w:sz="6"/>
+              <w:bottom w:val="single" w:color="1F3864" w:sz="6"/>
+              <w:right w:val="single" w:color="1F3864" w:sz="6"/>
+            </w:tcBorders>
+            <w:shd w:fill="1F3864" w:val="clear"/>
+            <w:tcMar>
+              <w:top w:type="dxa" w:w="100"/>
+              <w:left w:type="dxa" w:w="130"/>
+              <w:bottom w:type="dxa" w:w="100"/>
+              <w:right w:type="dxa" w:w="130"/>
+            </w:tcMar>
+            <w:vAlign w:val="center"/>
+          </w:tcPr>
+          <w:p>
+            <w:pPr>
+              <w:jc w:val="center"/>
+            </w:pPr>
+            <w:r>
+              <w:rPr>
+                <w:rFonts w:ascii="Arial" w:cs="Arial" w:eastAsia="Arial" w:hAnsi="Arial"/>
+                <w:b/>
+                <w:bCs/>
+                <w:color w:val="FFFFFF"/>
+                <w:sz w:val="18"/>
+                <w:szCs w:val="18"/>
+              </w:rPr>
+              <w:t xml:space="preserve">#</w:t>
+            </w:r>
+          </w:p>
+        </w:tc>
+        <w:tc>
+          <w:tcPr>
+            <w:tcW w:type="dxa" w:w="4200"/>
+            <w:gridSpan w:val="1"/>
+            <w:tcBorders>
+              <w:top w:val="single" w:color="1F3864" w:sz="6"/>
+              <w:left w:val="single" w:color="1F3864" w:sz="6"/>
+              <w:bottom w:val="single" w:color="1F3864" w:sz="6"/>
+              <w:right w:val="single" w:color="1F3864" w:sz="6"/>
+            </w:tcBorders>
+            <w:shd w:fill="1F3864" w:val="clear"/>
+            <w:tcMar>
+              <w:top w:type="dxa" w:w="100"/>
+              <w:left w:type="dxa" w:w="130"/>
+              <w:bottom w:type="dxa" w:w="100"/>
+              <w:right w:type="dxa" w:w="130"/>
+            </w:tcMar>
+            <w:vAlign w:val="center"/>
+          </w:tcPr>
+          <w:p>
+            <w:pPr>
+              <w:jc w:val="center"/>
+            </w:pPr>
+            <w:r>
+              <w:rPr>
+                <w:rFonts w:ascii="Arial" w:cs="Arial" w:eastAsia="Arial" w:hAnsi="Arial"/>
+                <w:b/>
+                <w:bCs/>
+                <w:color w:val="FFFFFF"/>
+                <w:sz w:val="18"/>
+                <w:szCs w:val="18"/>
+              </w:rPr>
+              <w:t xml:space="preserve">Task</w:t>
+            </w:r>
+          </w:p>
+        </w:tc>
+        <w:tc>
+          <w:tcPr>
+            <w:tcW w:type="dxa" w:w="2800"/>
+            <w:gridSpan w:val="1"/>
+            <w:tcBorders>
+              <w:top w:val="single" w:color="1F3864" w:sz="6"/>
+              <w:left w:val="single" w:color="1F3864" w:sz="6"/>
+              <w:bottom w:val="single" w:color="1F3864" w:sz="6"/>
+              <w:right w:val="single" w:color="1F3864" w:sz="6"/>
+            </w:tcBorders>
+            <w:shd w:fill="1F3864" w:val="clear"/>
+            <w:tcMar>
+              <w:top w:type="dxa" w:w="100"/>
+              <w:left w:type="dxa" w:w="130"/>
+              <w:bottom w:type="dxa" w:w="100"/>
+              <w:right w:type="dxa" w:w="130"/>
+            </w:tcMar>
+            <w:vAlign w:val="center"/>
+          </w:tcPr>
+          <w:p>
+            <w:pPr>
+              <w:jc w:val="center"/>
+            </w:pPr>
+            <w:r>
+              <w:rPr>
+                <w:rFonts w:ascii="Arial" w:cs="Arial" w:eastAsia="Arial" w:hAnsi="Arial"/>
+                <w:b/>
+                <w:bCs/>
+                <w:color w:val="FFFFFF"/>
+                <w:sz w:val="18"/>
+                <w:szCs w:val="18"/>
+              </w:rPr>
+              <w:t xml:space="preserve">Product</w:t>
+            </w:r>
+          </w:p>
+        </w:tc>
+        <w:tc>
+          <w:tcPr>
+            <w:tcW w:type="dxa" w:w="1300"/>
+            <w:gridSpan w:val="1"/>
+            <w:tcBorders>
+              <w:top w:val="single" w:color="1F3864" w:sz="6"/>
+              <w:left w:val="single" w:color="1F3864" w:sz="6"/>
+              <w:bottom w:val="single" w:color="1F3864" w:sz="6"/>
+              <w:right w:val="single" w:color="1F3864" w:sz="6"/>
+            </w:tcBorders>
+            <w:shd w:fill="1F3864" w:val="clear"/>
+            <w:tcMar>
+              <w:top w:type="dxa" w:w="100"/>
+              <w:left w:type="dxa" w:w="130"/>
+              <w:bottom w:type="dxa" w:w="100"/>
+              <w:right w:type="dxa" w:w="130"/>
+            </w:tcMar>
+            <w:vAlign w:val="center"/>
+          </w:tcPr>
+          <w:p>
+            <w:pPr>
+              <w:jc w:val="center"/>
+            </w:pPr>
+            <w:r>
+              <w:rPr>
+                <w:rFonts w:ascii="Arial" w:cs="Arial" w:eastAsia="Arial" w:hAnsi="Arial"/>
+                <w:b/>
+                <w:bCs/>
+                <w:color w:val="FFFFFF"/>
+                <w:sz w:val="18"/>
+                <w:szCs w:val="18"/>
+              </w:rPr>
+              <w:t xml:space="preserve">AOS</w:t>
+            </w:r>
+          </w:p>
+        </w:tc>
+        <w:tc>
+          <w:tcPr>
+            <w:tcW w:type="dxa" w:w="1300"/>
+            <w:gridSpan w:val="1"/>
+            <w:tcBorders>
+              <w:top w:val="single" w:color="1F3864" w:sz="6"/>
+              <w:left w:val="single" w:color="1F3864" w:sz="6"/>
+              <w:bottom w:val="single" w:color="1F3864" w:sz="6"/>
+              <w:right w:val="single" w:color="1F3864" w:sz="6"/>
+            </w:tcBorders>
+            <w:shd w:fill="1F3864" w:val="clear"/>
+            <w:tcMar>
+              <w:top w:type="dxa" w:w="100"/>
+              <w:left w:type="dxa" w:w="130"/>
+              <w:bottom w:type="dxa" w:w="100"/>
+              <w:right w:type="dxa" w:w="130"/>
+            </w:tcMar>
+            <w:vAlign w:val="center"/>
+          </w:tcPr>
+          <w:p>
+            <w:pPr>
+              <w:jc w:val="center"/>
+            </w:pPr>
+            <w:r>
+              <w:rPr>
+                <w:rFonts w:ascii="Arial" w:cs="Arial" w:eastAsia="Arial" w:hAnsi="Arial"/>
+                <w:b/>
+                <w:bCs/>
+                <w:color w:val="FFFFFF"/>
+                <w:sz w:val="18"/>
+                <w:szCs w:val="18"/>
+              </w:rPr>
+              <w:t xml:space="preserve">iOS</w:t>
+            </w:r>
+          </w:p>
+        </w:tc>
+        <w:tc>
+          <w:tcPr>
+            <w:tcW w:type="dxa" w:w="1700"/>
+            <w:gridSpan w:val="1"/>
+            <w:tcBorders>
+              <w:top w:val="single" w:color="1F3864" w:sz="6"/>
+              <w:left w:val="single" w:color="1F3864" w:sz="6"/>
+              <w:bottom w:val="single" w:color="1F3864" w:sz="6"/>
+              <w:right w:val="single" w:color="1F3864" w:sz="6"/>
+            </w:tcBorders>
+            <w:shd w:fill="1F3864" w:val="clear"/>
+            <w:tcMar>
+              <w:top w:type="dxa" w:w="100"/>
+              <w:left w:type="dxa" w:w="130"/>
+              <w:bottom w:type="dxa" w:w="100"/>
+              <w:right w:type="dxa" w:w="130"/>
+            </w:tcMar>
+            <w:vAlign w:val="center"/>
+          </w:tcPr>
+          <w:p>
+            <w:pPr>
+              <w:jc w:val="center"/>
+            </w:pPr>
+            <w:r>
+              <w:rPr>
+                <w:rFonts w:ascii="Arial" w:cs="Arial" w:eastAsia="Arial" w:hAnsi="Arial"/>
+                <w:b/>
+                <w:bCs/>
+                <w:color w:val="FFFFFF"/>
+                <w:sz w:val="18"/>
+                <w:szCs w:val="18"/>
+              </w:rPr>
+              <w:t xml:space="preserve">Status</w:t>
+            </w:r>
+          </w:p>
+        </w:tc>
+        <w:tc>
+          <w:tcPr>
+            <w:tcW w:type="dxa" w:w="3598"/>
+            <w:gridSpan w:val="1"/>
+            <w:tcBorders>
+              <w:top w:val="single" w:color="1F3864" w:sz="6"/>
+              <w:left w:val="single" w:color="1F3864" w:sz="6"/>
+              <w:bottom w:val="single" w:color="1F3864" w:sz="6"/>
+              <w:right w:val="single" w:color="1F3864" w:sz="6"/>
+            </w:tcBorders>
+            <w:shd w:fill="1F3864" w:val="clear"/>
+            <w:tcMar>
+              <w:top w:type="dxa" w:w="100"/>
+              <w:left w:type="dxa" w:w="130"/>
+              <w:bottom w:type="dxa" w:w="100"/>
+              <w:right w:type="dxa" w:w="130"/>
+            </w:tcMar>
+            <w:vAlign w:val="center"/>
+          </w:tcPr>
+          <w:p>
+            <w:pPr>
+              <w:jc w:val="center"/>
+            </w:pPr>
+            <w:r>
+              <w:rPr>
+                <w:rFonts w:ascii="Arial" w:cs="Arial" w:eastAsia="Arial" w:hAnsi="Arial"/>
+                <w:b/>
+                <w:bCs/>
+                <w:color w:val="FFFFFF"/>
+                <w:sz w:val="18"/>
+                <w:szCs w:val="18"/>
+              </w:rPr>
+              <w:t xml:space="preserve">Remarks</w:t>
+            </w:r>
+          </w:p>
+        </w:tc>
+      </w:tr>
+      <w:tr>
+        <w:tc>
+          <w:tcPr>
+            <w:tcW w:type="dxa" w:w="500"/>
+            <w:tcBorders>
+              <w:top w:val="single" w:color="AAAAAA" w:sz="1"/>
+              <w:left w:val="single" w:color="AAAAAA" w:sz="1"/>
+              <w:bottom w:val="single" w:color="AAAAAA" w:sz="1"/>
+              <w:right w:val="single" w:color="AAAAAA" w:sz="1"/>
+            </w:tcBorders>
+            <w:shd w:fill="FFFFFF" w:val="clear"/>
+            <w:tcMar>
+              <w:top w:type="dxa" w:w="80"/>
+              <w:left w:type="dxa" w:w="130"/>
+              <w:bottom w:type="dxa" w:w="80"/>
+              <w:right w:type="dxa" w:w="130"/>
+            </w:tcMar>
+            <w:vAlign w:val="center"/>
+          </w:tcPr>
+          <w:p>
+            <w:pPr>
+              <w:jc w:val="center"/>
+            </w:pPr>
+            <w:r>
+              <w:rPr>
+                <w:rFonts w:ascii="Arial" w:cs="Arial" w:eastAsia="Arial" w:hAnsi="Arial"/>
+                <w:b/>
+                <w:bCs/>
+                <w:color w:val="1F3864"/>
+                <w:sz w:val="17"/>
+                <w:szCs w:val="17"/>
+              </w:rPr>
+              <w:t xml:space="preserve">1</w:t>
+            </w:r>
+          </w:p>
+        </w:tc>
+        <w:tc>
+          <w:tcPr>
+            <w:tcW w:type="dxa" w:w="4200"/>
+            <w:tcBorders>
+              <w:top w:val="single" w:color="AAAAAA" w:sz="1"/>
+              <w:left w:val="single" w:color="AAAAAA" w:sz="1"/>
+              <w:bottom w:val="single" w:color="AAAAAA" w:sz="1"/>
+              <w:right w:val="single" w:color="AAAAAA" w:sz="1"/>
+            </w:tcBorders>
+            <w:shd w:fill="FFFFFF" w:val="clear"/>
+            <w:tcMar>
+              <w:top w:type="dxa" w:w="80"/>
+              <w:left w:type="dxa" w:w="130"/>
+              <w:bottom w:type="dxa" w:w="80"/>
+              <w:right w:type="dxa" w:w="130"/>
+            </w:tcMar>
+            <w:vAlign w:val="center"/>
+          </w:tcPr>
+          <w:p>
+            <w:pPr>
+              <w:jc w:val="left"/>
+            </w:pPr>
+            <w:r>
+              <w:rPr>
+                <w:rFonts w:ascii="Arial" w:cs="Arial" w:eastAsia="Arial" w:hAnsi="Arial"/>
+                <w:b w:val="false"/>
+                <w:bCs w:val="false"/>
+                <w:color w:val="595959"/>
+                <w:sz w:val="17"/>
+                <w:szCs w:val="17"/>
+              </w:rPr>
+              <w:t xml:space="preserve">양수흐 작업 개선 – User flow improvement for the main processing workflow</w:t>
+            </w:r>
+          </w:p>
+        </w:tc>
+        <w:tc>
+          <w:tcPr>
+            <w:tcW w:type="dxa" w:w="2800"/>
+            <w:tcBorders>
+              <w:top w:val="single" w:color="AAAAAA" w:sz="1"/>
+              <w:left w:val="single" w:color="AAAAAA" w:sz="1"/>
+              <w:bottom w:val="single" w:color="AAAAAA" w:sz="1"/>
+              <w:right w:val="single" w:color="AAAAAA" w:sz="1"/>
+            </w:tcBorders>
+            <w:shd w:fill="FFFFFF" w:val="clear"/>
+            <w:tcMar>
+              <w:top w:type="dxa" w:w="80"/>
+              <w:left w:type="dxa" w:w="130"/>
+              <w:bottom w:type="dxa" w:w="80"/>
+              <w:right w:type="dxa" w:w="130"/>
+            </w:tcMar>
+            <w:vAlign w:val="center"/>
+          </w:tcPr>
+          <w:p>
+            <w:pPr>
+              <w:jc w:val="left"/>
+            </w:pPr>
+            <w:r>
+              <w:rPr>
+                <w:rFonts w:ascii="Arial" w:cs="Arial" w:eastAsia="Arial" w:hAnsi="Arial"/>
+                <w:b/>
+                <w:bCs/>
+                <w:color w:val="2E5799"/>
+                <w:sz w:val="17"/>
+                <w:szCs w:val="17"/>
+              </w:rPr>
+              <w:t xml:space="preserve">iPPP Biz Play 4.0</w:t>
+            </w:r>
+          </w:p>
+        </w:tc>
+        <w:tc>
+          <w:tcPr>
+            <w:tcW w:type="dxa" w:w="1300"/>
+            <w:tcBorders>
+              <w:top w:val="single" w:color="AAAAAA" w:sz="1"/>
+              <w:left w:val="single" w:color="AAAAAA" w:sz="1"/>
+              <w:bottom w:val="single" w:color="AAAAAA" w:sz="1"/>
+              <w:right w:val="single" w:color="AAAAAA" w:sz="1"/>
+            </w:tcBorders>
+            <w:shd w:fill="FFFFFF" w:val="clear"/>
+            <w:tcMar>
+              <w:top w:type="dxa" w:w="80"/>
+              <w:left w:type="dxa" w:w="130"/>
+              <w:bottom w:type="dxa" w:w="80"/>
+              <w:right w:type="dxa" w:w="130"/>
+            </w:tcMar>
+            <w:vAlign w:val="center"/>
+          </w:tcPr>
+          <w:p>
+            <w:pPr>
+              <w:jc w:val="center"/>
+            </w:pPr>
+            <w:r>
+              <w:rPr>
+                <w:rFonts w:ascii="Arial" w:cs="Arial" w:eastAsia="Arial" w:hAnsi="Arial"/>
+                <w:b w:val="false"/>
+                <w:bCs w:val="false"/>
+                <w:color w:val="595959"/>
+                <w:sz w:val="17"/>
+                <w:szCs w:val="17"/>
+              </w:rPr>
+              <w:t xml:space="preserve">1.7.8</w:t>
+            </w:r>
+          </w:p>
+        </w:tc>
+        <w:tc>
+          <w:tcPr>
+            <w:tcW w:type="dxa" w:w="1300"/>
+            <w:tcBorders>
+              <w:top w:val="single" w:color="AAAAAA" w:sz="1"/>
+              <w:left w:val="single" w:color="AAAAAA" w:sz="1"/>
+              <w:bottom w:val="single" w:color="AAAAAA" w:sz="1"/>
+              <w:right w:val="single" w:color="AAAAAA" w:sz="1"/>
+            </w:tcBorders>
+            <w:shd w:fill="FFFFFF" w:val="clear"/>
+            <w:tcMar>
+              <w:top w:type="dxa" w:w="80"/>
+              <w:left w:type="dxa" w:w="130"/>
+              <w:bottom w:type="dxa" w:w="80"/>
+              <w:right w:type="dxa" w:w="130"/>
+            </w:tcMar>
+            <w:vAlign w:val="center"/>
+          </w:tcPr>
+          <w:p>
+            <w:pPr>
+              <w:jc w:val="center"/>
+            </w:pPr>
+            <w:r>
+              <w:rPr>
+                <w:rFonts w:ascii="Arial" w:cs="Arial" w:eastAsia="Arial" w:hAnsi="Arial"/>
+                <w:b w:val="false"/>
+                <w:bCs w:val="false"/>
+                <w:color w:val="595959"/>
+                <w:sz w:val="17"/>
+                <w:szCs w:val="17"/>
+              </w:rPr>
+              <w:t xml:space="preserve">1.7.8</w:t>
+            </w:r>
+          </w:p>
+        </w:tc>
+        <w:tc>
+          <w:tcPr>
+            <w:tcW w:type="dxa" w:w="1700"/>
+            <w:tcBorders>
+              <w:top w:val="single" w:color="AAAAAA" w:sz="1"/>
+              <w:left w:val="single" w:color="AAAAAA" w:sz="1"/>
+              <w:bottom w:val="single" w:color="AAAAAA" w:sz="1"/>
+              <w:right w:val="single" w:color="AAAAAA" w:sz="1"/>
+            </w:tcBorders>
+            <w:shd w:fill="E2EFDA" w:val="clear"/>
+            <w:tcMar>
+              <w:top w:type="dxa" w:w="80"/>
+              <w:left w:type="dxa" w:w="100"/>
+              <w:bottom w:type="dxa" w:w="80"/>
+              <w:right w:type="dxa" w:w="100"/>
+            </w:tcMar>
+            <w:vAlign w:val="center"/>
+          </w:tcPr>
+          <w:p>
+            <w:pPr>
+              <w:jc w:val="center"/>
+            </w:pPr>
+            <w:r>
+              <w:rPr>
+                <w:rFonts w:ascii="Arial" w:cs="Arial" w:eastAsia="Arial" w:hAnsi="Arial"/>
+                <w:b/>
+                <w:bCs/>
+                <w:color w:val="375623"/>
+                <w:sz w:val="17"/>
+                <w:szCs w:val="17"/>
+              </w:rPr>
+              <w:t xml:space="preserve">Completed</w:t>
+            </w:r>
+          </w:p>
+        </w:tc>
+        <w:tc>
+          <w:tcPr>
+            <w:tcW w:type="dxa" w:w="3598"/>
+            <w:tcBorders>
+              <w:top w:val="single" w:color="AAAAAA" w:sz="1"/>
+              <w:left w:val="single" w:color="AAAAAA" w:sz="1"/>
+              <w:bottom w:val="single" w:color="AAAAAA" w:sz="1"/>
+              <w:right w:val="single" w:color="AAAAAA" w:sz="1"/>
+            </w:tcBorders>
+            <w:shd w:fill="FFFFFF" w:val="clear"/>
+            <w:tcMar>
+              <w:top w:type="dxa" w:w="80"/>
+              <w:left w:type="dxa" w:w="130"/>
+              <w:bottom w:type="dxa" w:w="80"/>
+              <w:right w:type="dxa" w:w="130"/>
+            </w:tcMar>
+            <w:vAlign w:val="center"/>
+          </w:tcPr>
+          <w:p>
+            <w:pPr>
+              <w:jc w:val="left"/>
+            </w:pPr>
+            <w:r>
+              <w:rPr>
+                <w:rFonts w:ascii="Arial" w:cs="Arial" w:eastAsia="Arial" w:hAnsi="Arial"/>
+                <w:b w:val="false"/>
+                <w:bCs w:val="false"/>
+                <w:color w:val="595959"/>
+                <w:sz w:val="17"/>
+                <w:szCs w:val="17"/>
+              </w:rPr>
+              <w:t xml:space="preserve">Completed 02/11 — flow fully improved and released</w:t>
+            </w:r>
+          </w:p>
+        </w:tc>
+      </w:tr>
+      <w:tr>
+        <w:tc>
+          <w:tcPr>
+            <w:tcW w:type="dxa" w:w="500"/>
+            <w:tcBorders>
+              <w:top w:val="single" w:color="AAAAAA" w:sz="1"/>
+              <w:left w:val="single" w:color="AAAAAA" w:sz="1"/>
+              <w:bottom w:val="single" w:color="AAAAAA" w:sz="1"/>
+              <w:right w:val="single" w:color="AAAAAA" w:sz="1"/>
+            </w:tcBorders>
+            <w:shd w:fill="F5F5F5" w:val="clear"/>
+            <w:tcMar>
+              <w:top w:type="dxa" w:w="80"/>
+              <w:left w:type="dxa" w:w="130"/>
+              <w:bottom w:type="dxa" w:w="80"/>
+              <w:right w:type="dxa" w:w="130"/>
+            </w:tcMar>
+            <w:vAlign w:val="center"/>
+          </w:tcPr>
+          <w:p>
+            <w:pPr>
+              <w:jc w:val="center"/>
+            </w:pPr>
+            <w:r>
+              <w:rPr>
+                <w:rFonts w:ascii="Arial" w:cs="Arial" w:eastAsia="Arial" w:hAnsi="Arial"/>
+                <w:b/>
+                <w:bCs/>
+                <w:color w:val="1F3864"/>
+                <w:sz w:val="17"/>
+                <w:szCs w:val="17"/>
+              </w:rPr>
+              <w:t xml:space="preserve">2</w:t>
+            </w:r>
+          </w:p>
+        </w:tc>
+        <w:tc>
+          <w:tcPr>
+            <w:tcW w:type="dxa" w:w="4200"/>
+            <w:tcBorders>
+              <w:top w:val="single" w:color="AAAAAA" w:sz="1"/>
+              <w:left w:val="single" w:color="AAAAAA" w:sz="1"/>
+              <w:bottom w:val="single" w:color="AAAAAA" w:sz="1"/>
+              <w:right w:val="single" w:color="AAAAAA" w:sz="1"/>
+            </w:tcBorders>
+            <w:shd w:fill="F5F5F5" w:val="clear"/>
+            <w:tcMar>
+              <w:top w:type="dxa" w:w="80"/>
+              <w:left w:type="dxa" w:w="130"/>
+              <w:bottom w:type="dxa" w:w="80"/>
+              <w:right w:type="dxa" w:w="130"/>
+            </w:tcMar>
+            <w:vAlign w:val="center"/>
+          </w:tcPr>
+          <w:p>
+            <w:pPr>
+              <w:jc w:val="left"/>
+            </w:pPr>
+            <w:r>
+              <w:rPr>
+                <w:rFonts w:ascii="Arial" w:cs="Arial" w:eastAsia="Arial" w:hAnsi="Arial"/>
+                <w:b w:val="false"/>
+                <w:bCs w:val="false"/>
+                <w:color w:val="595959"/>
+                <w:sz w:val="17"/>
+                <w:szCs w:val="17"/>
+              </w:rPr>
+              <w:t xml:space="preserve">비밀번호 초기화 기능 사용 회사코드 – Password reset function &amp; company code configuration</w:t>
+            </w:r>
+          </w:p>
+        </w:tc>
+        <w:tc>
+          <w:tcPr>
+            <w:tcW w:type="dxa" w:w="2800"/>
+            <w:tcBorders>
+              <w:top w:val="single" w:color="AAAAAA" w:sz="1"/>
+              <w:left w:val="single" w:color="AAAAAA" w:sz="1"/>
+              <w:bottom w:val="single" w:color="AAAAAA" w:sz="1"/>
+              <w:right w:val="single" w:color="AAAAAA" w:sz="1"/>
+            </w:tcBorders>
+            <w:shd w:fill="F5F5F5" w:val="clear"/>
+            <w:tcMar>
+              <w:top w:type="dxa" w:w="80"/>
+              <w:left w:type="dxa" w:w="130"/>
+              <w:bottom w:type="dxa" w:w="80"/>
+              <w:right w:type="dxa" w:w="130"/>
+            </w:tcMar>
+            <w:vAlign w:val="center"/>
+          </w:tcPr>
+          <w:p>
+            <w:pPr>
+              <w:jc w:val="left"/>
+            </w:pPr>
+            <w:r>
+              <w:rPr>
+                <w:rFonts w:ascii="Arial" w:cs="Arial" w:eastAsia="Arial" w:hAnsi="Arial"/>
+                <w:b/>
+                <w:bCs/>
+                <w:color w:val="2E5799"/>
+                <w:sz w:val="17"/>
+                <w:szCs w:val="17"/>
+              </w:rPr>
+              <w:t xml:space="preserve">iPPP Biz Play 4.0</w:t>
+            </w:r>
+          </w:p>
+        </w:tc>
+        <w:tc>
+          <w:tcPr>
+            <w:tcW w:type="dxa" w:w="1300"/>
+            <w:tcBorders>
+              <w:top w:val="single" w:color="AAAAAA" w:sz="1"/>
+              <w:left w:val="single" w:color="AAAAAA" w:sz="1"/>
+              <w:bottom w:val="single" w:color="AAAAAA" w:sz="1"/>
+              <w:right w:val="single" w:color="AAAAAA" w:sz="1"/>
+            </w:tcBorders>
+            <w:shd w:fill="F5F5F5" w:val="clear"/>
+            <w:tcMar>
+              <w:top w:type="dxa" w:w="80"/>
+              <w:left w:type="dxa" w:w="130"/>
+              <w:bottom w:type="dxa" w:w="80"/>
+              <w:right w:type="dxa" w:w="130"/>
+            </w:tcMar>
+            <w:vAlign w:val="center"/>
+          </w:tcPr>
+          <w:p>
+            <w:pPr>
+              <w:jc w:val="center"/>
+            </w:pPr>
+            <w:r>
+              <w:rPr>
+                <w:rFonts w:ascii="Arial" w:cs="Arial" w:eastAsia="Arial" w:hAnsi="Arial"/>
+                <w:b w:val="false"/>
+                <w:bCs w:val="false"/>
+                <w:color w:val="595959"/>
+                <w:sz w:val="17"/>
+                <w:szCs w:val="17"/>
+              </w:rPr>
+              <w:t xml:space="preserve">1.7.8</w:t>
+            </w:r>
+          </w:p>
+        </w:tc>
+        <w:tc>
+          <w:tcPr>
+            <w:tcW w:type="dxa" w:w="1300"/>
+            <w:tcBorders>
+              <w:top w:val="single" w:color="AAAAAA" w:sz="1"/>
+              <w:left w:val="single" w:color="AAAAAA" w:sz="1"/>
+              <w:bottom w:val="single" w:color="AAAAAA" w:sz="1"/>
+              <w:right w:val="single" w:color="AAAAAA" w:sz="1"/>
+            </w:tcBorders>
+            <w:shd w:fill="F5F5F5" w:val="clear"/>
+            <w:tcMar>
+              <w:top w:type="dxa" w:w="80"/>
+              <w:left w:type="dxa" w:w="130"/>
+              <w:bottom w:type="dxa" w:w="80"/>
+              <w:right w:type="dxa" w:w="130"/>
+            </w:tcMar>
+            <w:vAlign w:val="center"/>
+          </w:tcPr>
+          <w:p>
+            <w:pPr>
+              <w:jc w:val="center"/>
+            </w:pPr>
+            <w:r>
+              <w:rPr>
+                <w:rFonts w:ascii="Arial" w:cs="Arial" w:eastAsia="Arial" w:hAnsi="Arial"/>
+                <w:b w:val="false"/>
+                <w:bCs w:val="false"/>
+                <w:color w:val="595959"/>
+                <w:sz w:val="17"/>
+                <w:szCs w:val="17"/>
+              </w:rPr>
+              <w:t xml:space="preserve">1.7.8</w:t>
+            </w:r>
+          </w:p>
+        </w:tc>
+        <w:tc>
+          <w:tcPr>
+            <w:tcW w:type="dxa" w:w="1700"/>
+            <w:tcBorders>
+              <w:top w:val="single" w:color="AAAAAA" w:sz="1"/>
+              <w:left w:val="single" w:color="AAAAAA" w:sz="1"/>
+              <w:bottom w:val="single" w:color="AAAAAA" w:sz="1"/>
+              <w:right w:val="single" w:color="AAAAAA" w:sz="1"/>
+            </w:tcBorders>
+            <w:shd w:fill="E2EFDA" w:val="clear"/>
+            <w:tcMar>
+              <w:top w:type="dxa" w:w="80"/>
+              <w:left w:type="dxa" w:w="100"/>
+              <w:bottom w:type="dxa" w:w="80"/>
+              <w:right w:type="dxa" w:w="100"/>
+            </w:tcMar>
+            <w:vAlign w:val="center"/>
+          </w:tcPr>
+          <w:p>
+            <w:pPr>
+              <w:jc w:val="center"/>
+            </w:pPr>
+            <w:r>
+              <w:rPr>
+                <w:rFonts w:ascii="Arial" w:cs="Arial" w:eastAsia="Arial" w:hAnsi="Arial"/>
+                <w:b/>
+                <w:bCs/>
+                <w:color w:val="375623"/>
+                <w:sz w:val="17"/>
+                <w:szCs w:val="17"/>
+              </w:rPr>
+              <w:t xml:space="preserve">Completed</w:t>
+            </w:r>
+          </w:p>
+        </w:tc>
+        <w:tc>
+          <w:tcPr>
+            <w:tcW w:type="dxa" w:w="3598"/>
+            <w:tcBorders>
+              <w:top w:val="single" w:color="AAAAAA" w:sz="1"/>
+              <w:left w:val="single" w:color="AAAAAA" w:sz="1"/>
+              <w:bottom w:val="single" w:color="AAAAAA" w:sz="1"/>
+              <w:right w:val="single" w:color="AAAAAA" w:sz="1"/>
+            </w:tcBorders>
+            <w:shd w:fill="F5F5F5" w:val="clear"/>
+            <w:tcMar>
+              <w:top w:type="dxa" w:w="80"/>
+              <w:left w:type="dxa" w:w="130"/>
+              <w:bottom w:type="dxa" w:w="80"/>
+              <w:right w:type="dxa" w:w="130"/>
+            </w:tcMar>
+            <w:vAlign w:val="center"/>
+          </w:tcPr>
+          <w:p>
+            <w:pPr>
+              <w:jc w:val="left"/>
+            </w:pPr>
+            <w:r>
+              <w:rPr>
+                <w:rFonts w:ascii="Arial" w:cs="Arial" w:eastAsia="Arial" w:hAnsi="Arial"/>
+                <w:b w:val="false"/>
+                <w:bCs w:val="false"/>
+                <w:color w:val="595959"/>
+                <w:sz w:val="17"/>
+                <w:szCs w:val="17"/>
+              </w:rPr>
+              <w:t xml:space="preserve">Completed 02/20 — reset feature live on both platforms</w:t>
+            </w:r>
+          </w:p>
+        </w:tc>
+      </w:tr>
+      <w:tr>
+        <w:tc>
+          <w:tcPr>
+            <w:tcW w:type="dxa" w:w="500"/>
+            <w:tcBorders>
+              <w:top w:val="single" w:color="AAAAAA" w:sz="1"/>
+              <w:left w:val="single" w:color="AAAAAA" w:sz="1"/>
+              <w:bottom w:val="single" w:color="AAAAAA" w:sz="1"/>
+              <w:right w:val="single" w:color="AAAAAA" w:sz="1"/>
+            </w:tcBorders>
+            <w:shd w:fill="FFFFFF" w:val="clear"/>
+            <w:tcMar>
+              <w:top w:type="dxa" w:w="80"/>
+              <w:left w:type="dxa" w:w="130"/>
+              <w:bottom w:type="dxa" w:w="80"/>
+              <w:right w:type="dxa" w:w="130"/>
+            </w:tcMar>
+            <w:vAlign w:val="center"/>
+          </w:tcPr>
+          <w:p>
+            <w:pPr>
+              <w:jc w:val="center"/>
+            </w:pPr>
+            <w:r>
+              <w:rPr>
+                <w:rFonts w:ascii="Arial" w:cs="Arial" w:eastAsia="Arial" w:hAnsi="Arial"/>
+                <w:b/>
+                <w:bCs/>
+                <w:color w:val="1F3864"/>
+                <w:sz w:val="17"/>
+                <w:szCs w:val="17"/>
+              </w:rPr>
+              <w:t xml:space="preserve">3</w:t>
+            </w:r>
+          </w:p>
+        </w:tc>
+        <w:tc>
+          <w:tcPr>
+            <w:tcW w:type="dxa" w:w="4200"/>
+            <w:tcBorders>
+              <w:top w:val="single" w:color="AAAAAA" w:sz="1"/>
+              <w:left w:val="single" w:color="AAAAAA" w:sz="1"/>
+              <w:bottom w:val="single" w:color="AAAAAA" w:sz="1"/>
+              <w:right w:val="single" w:color="AAAAAA" w:sz="1"/>
+            </w:tcBorders>
+            <w:shd w:fill="FFFFFF" w:val="clear"/>
+            <w:tcMar>
+              <w:top w:type="dxa" w:w="80"/>
+              <w:left w:type="dxa" w:w="130"/>
+              <w:bottom w:type="dxa" w:w="80"/>
+              <w:right w:type="dxa" w:w="130"/>
+            </w:tcMar>
+            <w:vAlign w:val="center"/>
+          </w:tcPr>
+          <w:p>
+            <w:pPr>
+              <w:jc w:val="left"/>
+            </w:pPr>
+            <w:r>
+              <w:rPr>
+                <w:rFonts w:ascii="Arial" w:cs="Arial" w:eastAsia="Arial" w:hAnsi="Arial"/>
+                <w:b w:val="false"/>
+                <w:bCs w:val="false"/>
+                <w:color w:val="595959"/>
+                <w:sz w:val="17"/>
+                <w:szCs w:val="17"/>
+              </w:rPr>
+              <w:t xml:space="preserve">[Feature] Tmap route function change → add 8 hardlink routes (하드링크 경로 8개 추가)</w:t>
+            </w:r>
+          </w:p>
+        </w:tc>
+        <w:tc>
+          <w:tcPr>
+            <w:tcW w:type="dxa" w:w="2800"/>
+            <w:tcBorders>
+              <w:top w:val="single" w:color="AAAAAA" w:sz="1"/>
+              <w:left w:val="single" w:color="AAAAAA" w:sz="1"/>
+              <w:bottom w:val="single" w:color="AAAAAA" w:sz="1"/>
+              <w:right w:val="single" w:color="AAAAAA" w:sz="1"/>
+            </w:tcBorders>
+            <w:shd w:fill="FFFFFF" w:val="clear"/>
+            <w:tcMar>
+              <w:top w:type="dxa" w:w="80"/>
+              <w:left w:type="dxa" w:w="130"/>
+              <w:bottom w:type="dxa" w:w="80"/>
+              <w:right w:type="dxa" w:w="130"/>
+            </w:tcMar>
+            <w:vAlign w:val="center"/>
+          </w:tcPr>
+          <w:p>
+            <w:pPr>
+              <w:jc w:val="left"/>
+            </w:pPr>
+            <w:r>
+              <w:rPr>
+                <w:rFonts w:ascii="Arial" w:cs="Arial" w:eastAsia="Arial" w:hAnsi="Arial"/>
+                <w:b/>
+                <w:bCs/>
+                <w:color w:val="2E5799"/>
+                <w:sz w:val="17"/>
+                <w:szCs w:val="17"/>
+              </w:rPr>
+              <w:t xml:space="preserve">iPPP Biz Play 4.0</w:t>
+            </w:r>
+          </w:p>
+        </w:tc>
+        <w:tc>
+          <w:tcPr>
+            <w:tcW w:type="dxa" w:w="1300"/>
+            <w:tcBorders>
+              <w:top w:val="single" w:color="AAAAAA" w:sz="1"/>
+              <w:left w:val="single" w:color="AAAAAA" w:sz="1"/>
+              <w:bottom w:val="single" w:color="AAAAAA" w:sz="1"/>
+              <w:right w:val="single" w:color="AAAAAA" w:sz="1"/>
+            </w:tcBorders>
+            <w:shd w:fill="FFFFFF" w:val="clear"/>
+            <w:tcMar>
+              <w:top w:type="dxa" w:w="80"/>
+              <w:left w:type="dxa" w:w="130"/>
+              <w:bottom w:type="dxa" w:w="80"/>
+              <w:right w:type="dxa" w:w="130"/>
+            </w:tcMar>
+            <w:vAlign w:val="center"/>
+          </w:tcPr>
+          <w:p>
+            <w:pPr>
+              <w:jc w:val="center"/>
+            </w:pPr>
+            <w:r>
+              <w:rPr>
+                <w:rFonts w:ascii="Arial" w:cs="Arial" w:eastAsia="Arial" w:hAnsi="Arial"/>
+                <w:b w:val="false"/>
+                <w:bCs w:val="false"/>
+                <w:color w:val="595959"/>
+                <w:sz w:val="17"/>
+                <w:szCs w:val="17"/>
+              </w:rPr>
+              <w:t xml:space="preserve">1.7.8</w:t>
+            </w:r>
+          </w:p>
+        </w:tc>
+        <w:tc>
+          <w:tcPr>
+            <w:tcW w:type="dxa" w:w="1300"/>
+            <w:tcBorders>
+              <w:top w:val="single" w:color="AAAAAA" w:sz="1"/>
+              <w:left w:val="single" w:color="AAAAAA" w:sz="1"/>
+              <w:bottom w:val="single" w:color="AAAAAA" w:sz="1"/>
+              <w:right w:val="single" w:color="AAAAAA" w:sz="1"/>
+            </w:tcBorders>
+            <w:shd w:fill="FFFFFF" w:val="clear"/>
+            <w:tcMar>
+              <w:top w:type="dxa" w:w="80"/>
+              <w:left w:type="dxa" w:w="130"/>
+              <w:bottom w:type="dxa" w:w="80"/>
+              <w:right w:type="dxa" w:w="130"/>
+            </w:tcMar>
+            <w:vAlign w:val="center"/>
+          </w:tcPr>
+          <w:p>
+            <w:pPr>
+              <w:jc w:val="center"/>
+            </w:pPr>
+            <w:r>
+              <w:rPr>
+                <w:rFonts w:ascii="Arial" w:cs="Arial" w:eastAsia="Arial" w:hAnsi="Arial"/>
+                <w:b w:val="false"/>
+                <w:bCs w:val="false"/>
+                <w:color w:val="595959"/>
+                <w:sz w:val="17"/>
+                <w:szCs w:val="17"/>
+              </w:rPr>
+              <w:t xml:space="preserve">1.7.8</w:t>
+            </w:r>
+          </w:p>
+        </w:tc>
+        <w:tc>
+          <w:tcPr>
+            <w:tcW w:type="dxa" w:w="1700"/>
+            <w:tcBorders>
+              <w:top w:val="single" w:color="AAAAAA" w:sz="1"/>
+              <w:left w:val="single" w:color="AAAAAA" w:sz="1"/>
+              <w:bottom w:val="single" w:color="AAAAAA" w:sz="1"/>
+              <w:right w:val="single" w:color="AAAAAA" w:sz="1"/>
+            </w:tcBorders>
+            <w:shd w:fill="EAE0F0" w:val="clear"/>
+            <w:tcMar>
+              <w:top w:type="dxa" w:w="80"/>
+              <w:left w:type="dxa" w:w="100"/>
+              <w:bottom w:type="dxa" w:w="80"/>
+              <w:right w:type="dxa" w:w="100"/>
+            </w:tcMar>
+            <w:vAlign w:val="center"/>
+          </w:tcPr>
+          <w:p>
+            <w:pPr>
+              <w:jc w:val="center"/>
+            </w:pPr>
+            <w:r>
+              <w:rPr>
+                <w:rFonts w:ascii="Arial" w:cs="Arial" w:eastAsia="Arial" w:hAnsi="Arial"/>
+                <w:b/>
+                <w:bCs/>
+                <w:color w:val="7030A0"/>
+                <w:sz w:val="17"/>
+                <w:szCs w:val="17"/>
+              </w:rPr>
+              <w:t xml:space="preserve">In Progress</w:t>
+            </w:r>
+          </w:p>
+        </w:tc>
+        <w:tc>
+          <w:tcPr>
+            <w:tcW w:type="dxa" w:w="3598"/>
+            <w:tcBorders>
+              <w:top w:val="single" w:color="AAAAAA" w:sz="1"/>
+              <w:left w:val="single" w:color="AAAAAA" w:sz="1"/>
+              <w:bottom w:val="single" w:color="AAAAAA" w:sz="1"/>
+              <w:right w:val="single" w:color="AAAAAA" w:sz="1"/>
+            </w:tcBorders>
+            <w:shd w:fill="FFFFFF" w:val="clear"/>
+            <w:tcMar>
+              <w:top w:type="dxa" w:w="80"/>
+              <w:left w:type="dxa" w:w="130"/>
+              <w:bottom w:type="dxa" w:w="80"/>
+              <w:right w:type="dxa" w:w="130"/>
+            </w:tcMar>
+            <w:vAlign w:val="center"/>
+          </w:tcPr>
+          <w:p>
+            <w:pPr>
+              <w:jc w:val="left"/>
+            </w:pPr>
+            <w:r>
+              <w:rPr>
+                <w:rFonts w:ascii="Arial" w:cs="Arial" w:eastAsia="Arial" w:hAnsi="Arial"/>
+                <w:b w:val="false"/>
+                <w:bCs w:val="false"/>
+                <w:color w:val="595959"/>
+                <w:sz w:val="17"/>
+                <w:szCs w:val="17"/>
+              </w:rPr>
+              <w:t xml:space="preserve">Development in progress as of 03/06 — hardlink routing under implementation</w:t>
+            </w:r>
+          </w:p>
+        </w:tc>
+      </w:tr>
+    </w:tbl>
+    <w:p>
+      <w:pPr>
+        <w:spacing w:after="160" w:before="0"/>
+      </w:pPr>
+      <w:r>
+        <w:t xml:space="preserve"/>
+      </w:r>
+    </w:p>
+    <w:p>
+      <w:pPr>
+        <w:spacing w:after="100" w:before="180"/>
+      </w:pPr>
+      <w:r>
+        <w:rPr>
+          <w:rFonts w:ascii="Arial" w:cs="Arial" w:eastAsia="Arial" w:hAnsi="Arial"/>
+          <w:b/>
+          <w:bCs/>
+          <w:color w:val="2E5799"/>
+          <w:sz w:val="22"/>
+          <w:szCs w:val="22"/>
+        </w:rPr>
+        <w:t xml:space="preserve">2.2  WiBillPay Center – 비블페이 (WiBillPay)</w:t>
+      </w:r>
+    </w:p>
+    <w:tbl>
+      <w:tblPr>
+        <w:tblW w:type="dxa" w:w="15398"/>
+        <w:tblBorders>
+          <w:top w:val="single" w:color="auto" w:sz="4"/>
+          <w:left w:val="single" w:color="auto" w:sz="4"/>
+          <w:bottom w:val="single" w:color="auto" w:sz="4"/>
+          <w:right w:val="single" w:color="auto" w:sz="4"/>
+          <w:insideH w:val="single" w:color="auto" w:sz="4"/>
+          <w:insideV w:val="single" w:color="auto" w:sz="4"/>
+        </w:tblBorders>
+      </w:tblPr>
+      <w:tblGrid>
+        <w:gridCol w:w="500"/>
+        <w:gridCol w:w="4200"/>
+        <w:gridCol w:w="2800"/>
+        <w:gridCol w:w="1300"/>
+        <w:gridCol w:w="1300"/>
+        <w:gridCol w:w="1700"/>
+        <w:gridCol w:w="3598"/>
+      </w:tblGrid>
+      <w:tr>
+        <w:trPr>
+          <w:tblHeader/>
+        </w:trPr>
+        <w:tc>
+          <w:tcPr>
+            <w:tcW w:type="dxa" w:w="500"/>
+            <w:gridSpan w:val="1"/>
+            <w:tcBorders>
+              <w:top w:val="single" w:color="1F3864" w:sz="6"/>
+              <w:left w:val="single" w:color="1F3864" w:sz="6"/>
+              <w:bottom w:val="single" w:color="1F3864" w:sz="6"/>
+              <w:right w:val="single" w:color="1F3864" w:sz="6"/>
+            </w:tcBorders>
+            <w:shd w:fill="1F3864" w:val="clear"/>
+            <w:tcMar>
+              <w:top w:type="dxa" w:w="100"/>
+              <w:left w:type="dxa" w:w="130"/>
+              <w:bottom w:type="dxa" w:w="100"/>
+              <w:right w:type="dxa" w:w="130"/>
+            </w:tcMar>
+            <w:vAlign w:val="center"/>
+          </w:tcPr>
+          <w:p>
+            <w:pPr>
+              <w:jc w:val="center"/>
+            </w:pPr>
+            <w:r>
+              <w:rPr>
+                <w:rFonts w:ascii="Arial" w:cs="Arial" w:eastAsia="Arial" w:hAnsi="Arial"/>
+                <w:b/>
+                <w:bCs/>
+                <w:color w:val="FFFFFF"/>
+                <w:sz w:val="18"/>
+                <w:szCs w:val="18"/>
+              </w:rPr>
+              <w:t xml:space="preserve">#</w:t>
+            </w:r>
+          </w:p>
+        </w:tc>
+        <w:tc>
+          <w:tcPr>
+            <w:tcW w:type="dxa" w:w="4200"/>
+            <w:gridSpan w:val="1"/>
+            <w:tcBorders>
+              <w:top w:val="single" w:color="1F3864" w:sz="6"/>
+              <w:left w:val="single" w:color="1F3864" w:sz="6"/>
+              <w:bottom w:val="single" w:color="1F3864" w:sz="6"/>
+              <w:right w:val="single" w:color="1F3864" w:sz="6"/>
+            </w:tcBorders>
+            <w:shd w:fill="1F3864" w:val="clear"/>
+            <w:tcMar>
+              <w:top w:type="dxa" w:w="100"/>
+              <w:left w:type="dxa" w:w="130"/>
+              <w:bottom w:type="dxa" w:w="100"/>
+              <w:right w:type="dxa" w:w="130"/>
+            </w:tcMar>
+            <w:vAlign w:val="center"/>
+          </w:tcPr>
+          <w:p>
+            <w:pPr>
+              <w:jc w:val="center"/>
+            </w:pPr>
+            <w:r>
+              <w:rPr>
+                <w:rFonts w:ascii="Arial" w:cs="Arial" w:eastAsia="Arial" w:hAnsi="Arial"/>
+                <w:b/>
+                <w:bCs/>
+                <w:color w:val="FFFFFF"/>
+                <w:sz w:val="18"/>
+                <w:szCs w:val="18"/>
+              </w:rPr>
+              <w:t xml:space="preserve">Task</w:t>
+            </w:r>
+          </w:p>
+        </w:tc>
+        <w:tc>
+          <w:tcPr>
+            <w:tcW w:type="dxa" w:w="2800"/>
+            <w:gridSpan w:val="1"/>
+            <w:tcBorders>
+              <w:top w:val="single" w:color="1F3864" w:sz="6"/>
+              <w:left w:val="single" w:color="1F3864" w:sz="6"/>
+              <w:bottom w:val="single" w:color="1F3864" w:sz="6"/>
+              <w:right w:val="single" w:color="1F3864" w:sz="6"/>
+            </w:tcBorders>
+            <w:shd w:fill="1F3864" w:val="clear"/>
+            <w:tcMar>
+              <w:top w:type="dxa" w:w="100"/>
+              <w:left w:type="dxa" w:w="130"/>
+              <w:bottom w:type="dxa" w:w="100"/>
+              <w:right w:type="dxa" w:w="130"/>
+            </w:tcMar>
+            <w:vAlign w:val="center"/>
+          </w:tcPr>
+          <w:p>
+            <w:pPr>
+              <w:jc w:val="center"/>
+            </w:pPr>
+            <w:r>
+              <w:rPr>
+                <w:rFonts w:ascii="Arial" w:cs="Arial" w:eastAsia="Arial" w:hAnsi="Arial"/>
+                <w:b/>
+                <w:bCs/>
+                <w:color w:val="FFFFFF"/>
+                <w:sz w:val="18"/>
+                <w:szCs w:val="18"/>
+              </w:rPr>
+              <w:t xml:space="preserve">Product</w:t>
+            </w:r>
+          </w:p>
+        </w:tc>
+        <w:tc>
+          <w:tcPr>
+            <w:tcW w:type="dxa" w:w="1300"/>
+            <w:gridSpan w:val="1"/>
+            <w:tcBorders>
+              <w:top w:val="single" w:color="1F3864" w:sz="6"/>
+              <w:left w:val="single" w:color="1F3864" w:sz="6"/>
+              <w:bottom w:val="single" w:color="1F3864" w:sz="6"/>
+              <w:right w:val="single" w:color="1F3864" w:sz="6"/>
+            </w:tcBorders>
+            <w:shd w:fill="1F3864" w:val="clear"/>
+            <w:tcMar>
+              <w:top w:type="dxa" w:w="100"/>
+              <w:left w:type="dxa" w:w="130"/>
+              <w:bottom w:type="dxa" w:w="100"/>
+              <w:right w:type="dxa" w:w="130"/>
+            </w:tcMar>
+            <w:vAlign w:val="center"/>
+          </w:tcPr>
+          <w:p>
+            <w:pPr>
+              <w:jc w:val="center"/>
+            </w:pPr>
+            <w:r>
+              <w:rPr>
+                <w:rFonts w:ascii="Arial" w:cs="Arial" w:eastAsia="Arial" w:hAnsi="Arial"/>
+                <w:b/>
+                <w:bCs/>
+                <w:color w:val="FFFFFF"/>
+                <w:sz w:val="18"/>
+                <w:szCs w:val="18"/>
+              </w:rPr>
+              <w:t xml:space="preserve">AOS</w:t>
+            </w:r>
+          </w:p>
+        </w:tc>
+        <w:tc>
+          <w:tcPr>
+            <w:tcW w:type="dxa" w:w="1300"/>
+            <w:gridSpan w:val="1"/>
+            <w:tcBorders>
+              <w:top w:val="single" w:color="1F3864" w:sz="6"/>
+              <w:left w:val="single" w:color="1F3864" w:sz="6"/>
+              <w:bottom w:val="single" w:color="1F3864" w:sz="6"/>
+              <w:right w:val="single" w:color="1F3864" w:sz="6"/>
+            </w:tcBorders>
+            <w:shd w:fill="1F3864" w:val="clear"/>
+            <w:tcMar>
+              <w:top w:type="dxa" w:w="100"/>
+              <w:left w:type="dxa" w:w="130"/>
+              <w:bottom w:type="dxa" w:w="100"/>
+              <w:right w:type="dxa" w:w="130"/>
+            </w:tcMar>
+            <w:vAlign w:val="center"/>
+          </w:tcPr>
+          <w:p>
+            <w:pPr>
+              <w:jc w:val="center"/>
+            </w:pPr>
+            <w:r>
+              <w:rPr>
+                <w:rFonts w:ascii="Arial" w:cs="Arial" w:eastAsia="Arial" w:hAnsi="Arial"/>
+                <w:b/>
+                <w:bCs/>
+                <w:color w:val="FFFFFF"/>
+                <w:sz w:val="18"/>
+                <w:szCs w:val="18"/>
+              </w:rPr>
+              <w:t xml:space="preserve">iOS</w:t>
+            </w:r>
+          </w:p>
+        </w:tc>
+        <w:tc>
+          <w:tcPr>
+            <w:tcW w:type="dxa" w:w="1700"/>
+            <w:gridSpan w:val="1"/>
+            <w:tcBorders>
+              <w:top w:val="single" w:color="1F3864" w:sz="6"/>
+              <w:left w:val="single" w:color="1F3864" w:sz="6"/>
+              <w:bottom w:val="single" w:color="1F3864" w:sz="6"/>
+              <w:right w:val="single" w:color="1F3864" w:sz="6"/>
+            </w:tcBorders>
+            <w:shd w:fill="1F3864" w:val="clear"/>
+            <w:tcMar>
+              <w:top w:type="dxa" w:w="100"/>
+              <w:left w:type="dxa" w:w="130"/>
+              <w:bottom w:type="dxa" w:w="100"/>
+              <w:right w:type="dxa" w:w="130"/>
+            </w:tcMar>
+            <w:vAlign w:val="center"/>
+          </w:tcPr>
+          <w:p>
+            <w:pPr>
+              <w:jc w:val="center"/>
+            </w:pPr>
+            <w:r>
+              <w:rPr>
+                <w:rFonts w:ascii="Arial" w:cs="Arial" w:eastAsia="Arial" w:hAnsi="Arial"/>
+                <w:b/>
+                <w:bCs/>
+                <w:color w:val="FFFFFF"/>
+                <w:sz w:val="18"/>
+                <w:szCs w:val="18"/>
+              </w:rPr>
+              <w:t xml:space="preserve">Status</w:t>
+            </w:r>
+          </w:p>
+        </w:tc>
+        <w:tc>
+          <w:tcPr>
+            <w:tcW w:type="dxa" w:w="3598"/>
+            <w:gridSpan w:val="1"/>
+            <w:tcBorders>
+              <w:top w:val="single" w:color="1F3864" w:sz="6"/>
+              <w:left w:val="single" w:color="1F3864" w:sz="6"/>
+              <w:bottom w:val="single" w:color="1F3864" w:sz="6"/>
+              <w:right w:val="single" w:color="1F3864" w:sz="6"/>
+            </w:tcBorders>
+            <w:shd w:fill="1F3864" w:val="clear"/>
+            <w:tcMar>
+              <w:top w:type="dxa" w:w="100"/>
+              <w:left w:type="dxa" w:w="130"/>
+              <w:bottom w:type="dxa" w:w="100"/>
+              <w:right w:type="dxa" w:w="130"/>
+            </w:tcMar>
+            <w:vAlign w:val="center"/>
+          </w:tcPr>
+          <w:p>
+            <w:pPr>
+              <w:jc w:val="center"/>
+            </w:pPr>
+            <w:r>
+              <w:rPr>
+                <w:rFonts w:ascii="Arial" w:cs="Arial" w:eastAsia="Arial" w:hAnsi="Arial"/>
+                <w:b/>
+                <w:bCs/>
+                <w:color w:val="FFFFFF"/>
+                <w:sz w:val="18"/>
+                <w:szCs w:val="18"/>
+              </w:rPr>
+              <w:t xml:space="preserve">Remarks</w:t>
+            </w:r>
+          </w:p>
+        </w:tc>
+      </w:tr>
+      <w:tr>
+        <w:tc>
+          <w:tcPr>
+            <w:tcW w:type="dxa" w:w="500"/>
+            <w:tcBorders>
+              <w:top w:val="single" w:color="AAAAAA" w:sz="1"/>
+              <w:left w:val="single" w:color="AAAAAA" w:sz="1"/>
+              <w:bottom w:val="single" w:color="AAAAAA" w:sz="1"/>
+              <w:right w:val="single" w:color="AAAAAA" w:sz="1"/>
+            </w:tcBorders>
+            <w:shd w:fill="FFFFFF" w:val="clear"/>
+            <w:tcMar>
+              <w:top w:type="dxa" w:w="80"/>
+              <w:left w:type="dxa" w:w="130"/>
+              <w:bottom w:type="dxa" w:w="80"/>
+              <w:right w:type="dxa" w:w="130"/>
+            </w:tcMar>
+            <w:vAlign w:val="center"/>
+          </w:tcPr>
+          <w:p>
+            <w:pPr>
+              <w:jc w:val="center"/>
+            </w:pPr>
+            <w:r>
+              <w:rPr>
+                <w:rFonts w:ascii="Arial" w:cs="Arial" w:eastAsia="Arial" w:hAnsi="Arial"/>
+                <w:b/>
+                <w:bCs/>
+                <w:color w:val="1F3864"/>
+                <w:sz w:val="17"/>
+                <w:szCs w:val="17"/>
+              </w:rPr>
+              <w:t xml:space="preserve">1</w:t>
+            </w:r>
+          </w:p>
+        </w:tc>
+        <w:tc>
+          <w:tcPr>
+            <w:tcW w:type="dxa" w:w="4200"/>
+            <w:tcBorders>
+              <w:top w:val="single" w:color="AAAAAA" w:sz="1"/>
+              <w:left w:val="single" w:color="AAAAAA" w:sz="1"/>
+              <w:bottom w:val="single" w:color="AAAAAA" w:sz="1"/>
+              <w:right w:val="single" w:color="AAAAAA" w:sz="1"/>
+            </w:tcBorders>
+            <w:shd w:fill="FFFFFF" w:val="clear"/>
+            <w:tcMar>
+              <w:top w:type="dxa" w:w="80"/>
+              <w:left w:type="dxa" w:w="130"/>
+              <w:bottom w:type="dxa" w:w="80"/>
+              <w:right w:type="dxa" w:w="130"/>
+            </w:tcMar>
+            <w:vAlign w:val="center"/>
+          </w:tcPr>
+          <w:p>
+            <w:pPr>
+              <w:jc w:val="left"/>
+            </w:pPr>
+            <w:r>
+              <w:rPr>
+                <w:rFonts w:ascii="Arial" w:cs="Arial" w:eastAsia="Arial" w:hAnsi="Arial"/>
+                <w:b w:val="false"/>
+                <w:bCs w:val="false"/>
+                <w:color w:val="595959"/>
+                <w:sz w:val="17"/>
+                <w:szCs w:val="17"/>
+              </w:rPr>
+              <w:t xml:space="preserve">Gongju Bank (공주은행) digital branch x Avatar attendance check integration (디지털브런치 x 아바타 출석체크 연계)</w:t>
+            </w:r>
+          </w:p>
+        </w:tc>
+        <w:tc>
+          <w:tcPr>
+            <w:tcW w:type="dxa" w:w="2800"/>
+            <w:tcBorders>
+              <w:top w:val="single" w:color="AAAAAA" w:sz="1"/>
+              <w:left w:val="single" w:color="AAAAAA" w:sz="1"/>
+              <w:bottom w:val="single" w:color="AAAAAA" w:sz="1"/>
+              <w:right w:val="single" w:color="AAAAAA" w:sz="1"/>
+            </w:tcBorders>
+            <w:shd w:fill="FFFFFF" w:val="clear"/>
+            <w:tcMar>
+              <w:top w:type="dxa" w:w="80"/>
+              <w:left w:type="dxa" w:w="130"/>
+              <w:bottom w:type="dxa" w:w="80"/>
+              <w:right w:type="dxa" w:w="130"/>
+            </w:tcMar>
+            <w:vAlign w:val="center"/>
+          </w:tcPr>
+          <w:p>
+            <w:pPr>
+              <w:jc w:val="left"/>
+            </w:pPr>
+            <w:r>
+              <w:rPr>
+                <w:rFonts w:ascii="Arial" w:cs="Arial" w:eastAsia="Arial" w:hAnsi="Arial"/>
+                <w:b/>
+                <w:bCs/>
+                <w:color w:val="2E5799"/>
+                <w:sz w:val="17"/>
+                <w:szCs w:val="17"/>
+              </w:rPr>
+              <w:t xml:space="preserve">WiBillPay</w:t>
+            </w:r>
+          </w:p>
+        </w:tc>
+        <w:tc>
+          <w:tcPr>
+            <w:tcW w:type="dxa" w:w="1300"/>
+            <w:tcBorders>
+              <w:top w:val="single" w:color="AAAAAA" w:sz="1"/>
+              <w:left w:val="single" w:color="AAAAAA" w:sz="1"/>
+              <w:bottom w:val="single" w:color="AAAAAA" w:sz="1"/>
+              <w:right w:val="single" w:color="AAAAAA" w:sz="1"/>
+            </w:tcBorders>
+            <w:shd w:fill="FFFFFF" w:val="clear"/>
+            <w:tcMar>
+              <w:top w:type="dxa" w:w="80"/>
+              <w:left w:type="dxa" w:w="130"/>
+              <w:bottom w:type="dxa" w:w="80"/>
+              <w:right w:type="dxa" w:w="130"/>
+            </w:tcMar>
+            <w:vAlign w:val="center"/>
+          </w:tcPr>
+          <w:p>
+            <w:pPr>
+              <w:jc w:val="center"/>
+            </w:pPr>
+            <w:r>
+              <w:rPr>
+                <w:rFonts w:ascii="Arial" w:cs="Arial" w:eastAsia="Arial" w:hAnsi="Arial"/>
+                <w:b w:val="false"/>
+                <w:bCs w:val="false"/>
+                <w:color w:val="595959"/>
+                <w:sz w:val="17"/>
+                <w:szCs w:val="17"/>
+              </w:rPr>
+              <w:t xml:space="preserve">1.10.28</w:t>
+            </w:r>
+          </w:p>
+        </w:tc>
+        <w:tc>
+          <w:tcPr>
+            <w:tcW w:type="dxa" w:w="1300"/>
+            <w:tcBorders>
+              <w:top w:val="single" w:color="AAAAAA" w:sz="1"/>
+              <w:left w:val="single" w:color="AAAAAA" w:sz="1"/>
+              <w:bottom w:val="single" w:color="AAAAAA" w:sz="1"/>
+              <w:right w:val="single" w:color="AAAAAA" w:sz="1"/>
+            </w:tcBorders>
+            <w:shd w:fill="FFFFFF" w:val="clear"/>
+            <w:tcMar>
+              <w:top w:type="dxa" w:w="80"/>
+              <w:left w:type="dxa" w:w="130"/>
+              <w:bottom w:type="dxa" w:w="80"/>
+              <w:right w:type="dxa" w:w="130"/>
+            </w:tcMar>
+            <w:vAlign w:val="center"/>
+          </w:tcPr>
+          <w:p>
+            <w:pPr>
+              <w:jc w:val="center"/>
+            </w:pPr>
+            <w:r>
+              <w:rPr>
+                <w:rFonts w:ascii="Arial" w:cs="Arial" w:eastAsia="Arial" w:hAnsi="Arial"/>
+                <w:b w:val="false"/>
+                <w:bCs w:val="false"/>
+                <w:color w:val="595959"/>
+                <w:sz w:val="17"/>
+                <w:szCs w:val="17"/>
+              </w:rPr>
+              <w:t xml:space="preserve">1.10.14</w:t>
+            </w:r>
+          </w:p>
+        </w:tc>
+        <w:tc>
+          <w:tcPr>
+            <w:tcW w:type="dxa" w:w="1700"/>
+            <w:tcBorders>
+              <w:top w:val="single" w:color="AAAAAA" w:sz="1"/>
+              <w:left w:val="single" w:color="AAAAAA" w:sz="1"/>
+              <w:bottom w:val="single" w:color="AAAAAA" w:sz="1"/>
+              <w:right w:val="single" w:color="AAAAAA" w:sz="1"/>
+            </w:tcBorders>
+            <w:shd w:fill="E2EFDA" w:val="clear"/>
+            <w:tcMar>
+              <w:top w:type="dxa" w:w="80"/>
+              <w:left w:type="dxa" w:w="100"/>
+              <w:bottom w:type="dxa" w:w="80"/>
+              <w:right w:type="dxa" w:w="100"/>
+            </w:tcMar>
+            <w:vAlign w:val="center"/>
+          </w:tcPr>
+          <w:p>
+            <w:pPr>
+              <w:jc w:val="center"/>
+            </w:pPr>
+            <w:r>
+              <w:rPr>
+                <w:rFonts w:ascii="Arial" w:cs="Arial" w:eastAsia="Arial" w:hAnsi="Arial"/>
+                <w:b/>
+                <w:bCs/>
+                <w:color w:val="375623"/>
+                <w:sz w:val="17"/>
+                <w:szCs w:val="17"/>
+              </w:rPr>
+              <w:t xml:space="preserve">Completed</w:t>
+            </w:r>
+          </w:p>
+        </w:tc>
+        <w:tc>
+          <w:tcPr>
+            <w:tcW w:type="dxa" w:w="3598"/>
+            <w:tcBorders>
+              <w:top w:val="single" w:color="AAAAAA" w:sz="1"/>
+              <w:left w:val="single" w:color="AAAAAA" w:sz="1"/>
+              <w:bottom w:val="single" w:color="AAAAAA" w:sz="1"/>
+              <w:right w:val="single" w:color="AAAAAA" w:sz="1"/>
+            </w:tcBorders>
+            <w:shd w:fill="FFFFFF" w:val="clear"/>
+            <w:tcMar>
+              <w:top w:type="dxa" w:w="80"/>
+              <w:left w:type="dxa" w:w="130"/>
+              <w:bottom w:type="dxa" w:w="80"/>
+              <w:right w:type="dxa" w:w="130"/>
+            </w:tcMar>
+            <w:vAlign w:val="center"/>
+          </w:tcPr>
+          <w:p>
+            <w:pPr>
+              <w:jc w:val="left"/>
+            </w:pPr>
+            <w:r>
+              <w:rPr>
+                <w:rFonts w:ascii="Arial" w:cs="Arial" w:eastAsia="Arial" w:hAnsi="Arial"/>
+                <w:b w:val="false"/>
+                <w:bCs w:val="false"/>
+                <w:color w:val="595959"/>
+                <w:sz w:val="17"/>
+                <w:szCs w:val="17"/>
+              </w:rPr>
+              <w:t xml:space="preserve">Completed 01/26 — integration delivered and live</w:t>
+            </w:r>
+          </w:p>
+        </w:tc>
+      </w:tr>
+      <w:tr>
+        <w:tc>
+          <w:tcPr>
+            <w:tcW w:type="dxa" w:w="500"/>
+            <w:tcBorders>
+              <w:top w:val="single" w:color="AAAAAA" w:sz="1"/>
+              <w:left w:val="single" w:color="AAAAAA" w:sz="1"/>
+              <w:bottom w:val="single" w:color="AAAAAA" w:sz="1"/>
+              <w:right w:val="single" w:color="AAAAAA" w:sz="1"/>
+            </w:tcBorders>
+            <w:shd w:fill="F5F5F5" w:val="clear"/>
+            <w:tcMar>
+              <w:top w:type="dxa" w:w="80"/>
+              <w:left w:type="dxa" w:w="130"/>
+              <w:bottom w:type="dxa" w:w="80"/>
+              <w:right w:type="dxa" w:w="130"/>
+            </w:tcMar>
+            <w:vAlign w:val="center"/>
+          </w:tcPr>
+          <w:p>
+            <w:pPr>
+              <w:jc w:val="center"/>
+            </w:pPr>
+            <w:r>
+              <w:rPr>
+                <w:rFonts w:ascii="Arial" w:cs="Arial" w:eastAsia="Arial" w:hAnsi="Arial"/>
+                <w:b/>
+                <w:bCs/>
+                <w:color w:val="1F3864"/>
+                <w:sz w:val="17"/>
+                <w:szCs w:val="17"/>
+              </w:rPr>
+              <w:t xml:space="preserve">2</w:t>
+            </w:r>
+          </w:p>
+        </w:tc>
+        <w:tc>
+          <w:tcPr>
+            <w:tcW w:type="dxa" w:w="4200"/>
+            <w:tcBorders>
+              <w:top w:val="single" w:color="AAAAAA" w:sz="1"/>
+              <w:left w:val="single" w:color="AAAAAA" w:sz="1"/>
+              <w:bottom w:val="single" w:color="AAAAAA" w:sz="1"/>
+              <w:right w:val="single" w:color="AAAAAA" w:sz="1"/>
+            </w:tcBorders>
+            <w:shd w:fill="F5F5F5" w:val="clear"/>
+            <w:tcMar>
+              <w:top w:type="dxa" w:w="80"/>
+              <w:left w:type="dxa" w:w="130"/>
+              <w:bottom w:type="dxa" w:w="80"/>
+              <w:right w:type="dxa" w:w="130"/>
+            </w:tcMar>
+            <w:vAlign w:val="center"/>
+          </w:tcPr>
+          <w:p>
+            <w:pPr>
+              <w:jc w:val="left"/>
+            </w:pPr>
+            <w:r>
+              <w:rPr>
+                <w:rFonts w:ascii="Arial" w:cs="Arial" w:eastAsia="Arial" w:hAnsi="Arial"/>
+                <w:b w:val="false"/>
+                <w:bCs w:val="false"/>
+                <w:color w:val="595959"/>
+                <w:sz w:val="17"/>
+                <w:szCs w:val="17"/>
+              </w:rPr>
+              <w:t xml:space="preserve">Attendance check icon design adjustment (출석체크 아이콘 디자인 관부)</w:t>
+            </w:r>
+          </w:p>
+        </w:tc>
+        <w:tc>
+          <w:tcPr>
+            <w:tcW w:type="dxa" w:w="2800"/>
+            <w:tcBorders>
+              <w:top w:val="single" w:color="AAAAAA" w:sz="1"/>
+              <w:left w:val="single" w:color="AAAAAA" w:sz="1"/>
+              <w:bottom w:val="single" w:color="AAAAAA" w:sz="1"/>
+              <w:right w:val="single" w:color="AAAAAA" w:sz="1"/>
+            </w:tcBorders>
+            <w:shd w:fill="F5F5F5" w:val="clear"/>
+            <w:tcMar>
+              <w:top w:type="dxa" w:w="80"/>
+              <w:left w:type="dxa" w:w="130"/>
+              <w:bottom w:type="dxa" w:w="80"/>
+              <w:right w:type="dxa" w:w="130"/>
+            </w:tcMar>
+            <w:vAlign w:val="center"/>
+          </w:tcPr>
+          <w:p>
+            <w:pPr>
+              <w:jc w:val="left"/>
+            </w:pPr>
+            <w:r>
+              <w:rPr>
+                <w:rFonts w:ascii="Arial" w:cs="Arial" w:eastAsia="Arial" w:hAnsi="Arial"/>
+                <w:b/>
+                <w:bCs/>
+                <w:color w:val="2E5799"/>
+                <w:sz w:val="17"/>
+                <w:szCs w:val="17"/>
+              </w:rPr>
+              <w:t xml:space="preserve">WiBillPay</w:t>
+            </w:r>
+          </w:p>
+        </w:tc>
+        <w:tc>
+          <w:tcPr>
+            <w:tcW w:type="dxa" w:w="1300"/>
+            <w:tcBorders>
+              <w:top w:val="single" w:color="AAAAAA" w:sz="1"/>
+              <w:left w:val="single" w:color="AAAAAA" w:sz="1"/>
+              <w:bottom w:val="single" w:color="AAAAAA" w:sz="1"/>
+              <w:right w:val="single" w:color="AAAAAA" w:sz="1"/>
+            </w:tcBorders>
+            <w:shd w:fill="F5F5F5" w:val="clear"/>
+            <w:tcMar>
+              <w:top w:type="dxa" w:w="80"/>
+              <w:left w:type="dxa" w:w="130"/>
+              <w:bottom w:type="dxa" w:w="80"/>
+              <w:right w:type="dxa" w:w="130"/>
+            </w:tcMar>
+            <w:vAlign w:val="center"/>
+          </w:tcPr>
+          <w:p>
+            <w:pPr>
+              <w:jc w:val="center"/>
+            </w:pPr>
+            <w:r>
+              <w:rPr>
+                <w:rFonts w:ascii="Arial" w:cs="Arial" w:eastAsia="Arial" w:hAnsi="Arial"/>
+                <w:b w:val="false"/>
+                <w:bCs w:val="false"/>
+                <w:color w:val="595959"/>
+                <w:sz w:val="17"/>
+                <w:szCs w:val="17"/>
+              </w:rPr>
+              <w:t xml:space="preserve">1.10.28</w:t>
+            </w:r>
+          </w:p>
+        </w:tc>
+        <w:tc>
+          <w:tcPr>
+            <w:tcW w:type="dxa" w:w="1300"/>
+            <w:tcBorders>
+              <w:top w:val="single" w:color="AAAAAA" w:sz="1"/>
+              <w:left w:val="single" w:color="AAAAAA" w:sz="1"/>
+              <w:bottom w:val="single" w:color="AAAAAA" w:sz="1"/>
+              <w:right w:val="single" w:color="AAAAAA" w:sz="1"/>
+            </w:tcBorders>
+            <w:shd w:fill="F5F5F5" w:val="clear"/>
+            <w:tcMar>
+              <w:top w:type="dxa" w:w="80"/>
+              <w:left w:type="dxa" w:w="130"/>
+              <w:bottom w:type="dxa" w:w="80"/>
+              <w:right w:type="dxa" w:w="130"/>
+            </w:tcMar>
+            <w:vAlign w:val="center"/>
+          </w:tcPr>
+          <w:p>
+            <w:pPr>
+              <w:jc w:val="center"/>
+            </w:pPr>
+            <w:r>
+              <w:rPr>
+                <w:rFonts w:ascii="Arial" w:cs="Arial" w:eastAsia="Arial" w:hAnsi="Arial"/>
+                <w:b w:val="false"/>
+                <w:bCs w:val="false"/>
+                <w:color w:val="595959"/>
+                <w:sz w:val="17"/>
+                <w:szCs w:val="17"/>
+              </w:rPr>
+              <w:t xml:space="preserve">1.10.14</w:t>
+            </w:r>
+          </w:p>
+        </w:tc>
+        <w:tc>
+          <w:tcPr>
+            <w:tcW w:type="dxa" w:w="1700"/>
+            <w:tcBorders>
+              <w:top w:val="single" w:color="AAAAAA" w:sz="1"/>
+              <w:left w:val="single" w:color="AAAAAA" w:sz="1"/>
+              <w:bottom w:val="single" w:color="AAAAAA" w:sz="1"/>
+              <w:right w:val="single" w:color="AAAAAA" w:sz="1"/>
+            </w:tcBorders>
+            <w:shd w:fill="E2EFDA" w:val="clear"/>
+            <w:tcMar>
+              <w:top w:type="dxa" w:w="80"/>
+              <w:left w:type="dxa" w:w="100"/>
+              <w:bottom w:type="dxa" w:w="80"/>
+              <w:right w:type="dxa" w:w="100"/>
+            </w:tcMar>
+            <w:vAlign w:val="center"/>
+          </w:tcPr>
+          <w:p>
+            <w:pPr>
+              <w:jc w:val="center"/>
+            </w:pPr>
+            <w:r>
+              <w:rPr>
+                <w:rFonts w:ascii="Arial" w:cs="Arial" w:eastAsia="Arial" w:hAnsi="Arial"/>
+                <w:b/>
+                <w:bCs/>
+                <w:color w:val="375623"/>
+                <w:sz w:val="17"/>
+                <w:szCs w:val="17"/>
+              </w:rPr>
+              <w:t xml:space="preserve">Completed</w:t>
+            </w:r>
+          </w:p>
+        </w:tc>
+        <w:tc>
+          <w:tcPr>
+            <w:tcW w:type="dxa" w:w="3598"/>
+            <w:tcBorders>
+              <w:top w:val="single" w:color="AAAAAA" w:sz="1"/>
+              <w:left w:val="single" w:color="AAAAAA" w:sz="1"/>
+              <w:bottom w:val="single" w:color="AAAAAA" w:sz="1"/>
+              <w:right w:val="single" w:color="AAAAAA" w:sz="1"/>
+            </w:tcBorders>
+            <w:shd w:fill="F5F5F5" w:val="clear"/>
+            <w:tcMar>
+              <w:top w:type="dxa" w:w="80"/>
+              <w:left w:type="dxa" w:w="130"/>
+              <w:bottom w:type="dxa" w:w="80"/>
+              <w:right w:type="dxa" w:w="130"/>
+            </w:tcMar>
+            <w:vAlign w:val="center"/>
+          </w:tcPr>
+          <w:p>
+            <w:pPr>
+              <w:jc w:val="left"/>
+            </w:pPr>
+            <w:r>
+              <w:rPr>
+                <w:rFonts w:ascii="Arial" w:cs="Arial" w:eastAsia="Arial" w:hAnsi="Arial"/>
+                <w:b w:val="false"/>
+                <w:bCs w:val="false"/>
+                <w:color w:val="595959"/>
+                <w:sz w:val="17"/>
+                <w:szCs w:val="17"/>
+              </w:rPr>
+              <w:t xml:space="preserve">Completed 02/20 — icon updated on both AOS and iOS</w:t>
+            </w:r>
+          </w:p>
+        </w:tc>
+      </w:tr>
+    </w:tbl>
+    <w:p>
+      <w:pPr>
+        <w:spacing w:after="200" w:before="0"/>
+      </w:pPr>
+      <w:r>
+        <w:t xml:space="preserve"/>
+      </w:r>
+    </w:p>
+    <w:p>
+      <w:r>
+        <w:br w:type="page"/>
+      </w:r>
+    </w:p>
+    <w:p>
+      <w:pPr>
+        <w:pBdr>
+          <w:bottom w:val="single" w:color="1F3864" w:sz="6" w:space="4"/>
+        </w:pBdr>
+        <w:spacing w:after="160" w:before="240"/>
+      </w:pPr>
+      <w:r>
+        <w:rPr>
+          <w:rFonts w:ascii="Arial" w:cs="Arial" w:eastAsia="Arial" w:hAnsi="Arial"/>
+          <w:b/>
+          <w:bCs/>
+          <w:color w:val="1F3864"/>
+          <w:sz w:val="28"/>
+          <w:szCs w:val="28"/>
+        </w:rPr>
+        <w:t xml:space="preserve">3. Web Scraping Team – COOCON Outsourcing (Q1 2026 Progress)</w:t>
       </w:r>
     </w:p>
     <w:p>
@@ -11070,7 +12959,7 @@
           <w:sz w:val="28"/>
           <w:szCs w:val="28"/>
         </w:rPr>
-        <w:t xml:space="preserve">3. Scraping Team</w:t>
+        <w:t xml:space="preserve">4. Scraping Team</w:t>
       </w:r>
     </w:p>
     <w:p>
@@ -11277,7 +13166,7 @@
                 <w:sz w:val="18"/>
                 <w:szCs w:val="18"/>
               </w:rPr>
-              <w:t xml:space="preserve">Both Prime MFI and Maxima MFI have reached 90% NBC submission and technical UAT. Production environments are active. MOU signing and service launch are the final pending milestones.</w:t>
+              <w:t xml:space="preserve">Both Prime MFI and Maxima MFI have reached 90% NBC submission and technical UAT. Production is active. MOU signing and service launch are the final pending milestones.</w:t>
             </w:r>
           </w:p>
         </w:tc>
@@ -11341,7 +13230,7 @@
                 <w:sz w:val="18"/>
                 <w:szCs w:val="18"/>
               </w:rPr>
-              <w:t xml:space="preserve">KongKea Capital is at 20% NBC/UAT stage. Accelerated support required to bring them to parity with Prime and Maxima.</w:t>
+              <w:t xml:space="preserve">KongKea Capital is at 20% NBC/UAT. Accelerated support is needed to bring them in line with Prime and Maxima.</w:t>
             </w:r>
           </w:p>
         </w:tc>
@@ -11405,7 +13294,7 @@
                 <w:sz w:val="18"/>
                 <w:szCs w:val="18"/>
               </w:rPr>
-              <w:t xml:space="preserve">NDA with BAMC Finance is 99% complete. WeUMS contract was signed on 13 February 2026. SMS issue (6,051 messages) was fully resolved.</w:t>
+              <w:t xml:space="preserve">NDA with BAMC Finance is 99% complete. WeUMS contract was signed on 13 February 2026. SMS issue (6,051 messages) fully resolved.</w:t>
             </w:r>
           </w:p>
         </w:tc>
@@ -11469,7 +13358,7 @@
                 <w:sz w:val="18"/>
                 <w:szCs w:val="18"/>
               </w:rPr>
-              <w:t xml:space="preserve">MOU completed with 30 companies. Five initial companies are beginning onboarding. E-Invoice AC system integration planning has commenced.</w:t>
+              <w:t xml:space="preserve">MOU completed with 30 companies. Five initial companies begin onboarding. E-Invoice AC system integration planning commenced.</w:t>
             </w:r>
           </w:p>
         </w:tc>
@@ -11533,7 +13422,7 @@
                 <w:sz w:val="18"/>
                 <w:szCs w:val="18"/>
               </w:rPr>
-              <w:t xml:space="preserve">A full product presentation (WeBill365 + WeLoan + WeUMS) is scheduled for March 28. Materials preparation is required.</w:t>
+              <w:t xml:space="preserve">Full product presentation (WeBill365 + WeLoan + WeUMS) is scheduled for March 28. Materials preparation is required urgently.</w:t>
             </w:r>
           </w:p>
         </w:tc>
@@ -11597,7 +13486,7 @@
                 <w:sz w:val="18"/>
                 <w:szCs w:val="18"/>
               </w:rPr>
-              <w:t xml:space="preserve">AMK Microfinance is transitioning to AMK Commercial Bank. MOU is being updated accordingly. Presentation to Ms. Sodheath is planned for March 29.</w:t>
+              <w:t xml:space="preserve">AMK Microfinance is transitioning to AMK Commercial Bank. MOU is being updated accordingly. Presentation to Ms. Sodheath planned for March 29.</w:t>
             </w:r>
           </w:p>
         </w:tc>
@@ -11661,7 +13550,7 @@
                 <w:sz w:val="18"/>
                 <w:szCs w:val="18"/>
               </w:rPr>
-              <w:t xml:space="preserve">KOSIGN-Bakong business partnership session on WeBill365 was completed on March 15, 2026.</w:t>
+              <w:t xml:space="preserve">KOSIGN-Bakong business partnership session on WeBill365 was successfully completed on March 15, 2026.</w:t>
             </w:r>
           </w:p>
         </w:tc>
@@ -11695,7 +13584,7 @@
                 <w:sz w:val="18"/>
                 <w:szCs w:val="18"/>
               </w:rPr>
-              <w:t xml:space="preserve">COOCON Q1 2026 – PDSM &amp; CooconProxy</w:t>
+              <w:t xml:space="preserve">Mobile – iPPP Tmap Route Feature</w:t>
             </w:r>
           </w:p>
         </w:tc>
@@ -11725,7 +13614,7 @@
                 <w:sz w:val="18"/>
                 <w:szCs w:val="18"/>
               </w:rPr>
-              <w:t xml:space="preserve">Public My Data (PDSM) development is on track as a key Q1 2026 milestone. CooconProxy Admin development is targeting Q2 completion (within 3 months).</w:t>
+              <w:t xml:space="preserve">Tmap route function change (adding 8 hardlink routes) is in progress as of 03/06 under iPPP Business Play 4.0 v1.7.8. Completion expected soon.</w:t>
             </w:r>
           </w:p>
         </w:tc>
@@ -11759,7 +13648,7 @@
                 <w:sz w:val="18"/>
                 <w:szCs w:val="18"/>
               </w:rPr>
-              <w:t xml:space="preserve">i-SAS Studio Enhancement</w:t>
+              <w:t xml:space="preserve">Mobile – WiBillPay Milestones</w:t>
             </w:r>
           </w:p>
         </w:tc>
@@ -11789,7 +13678,7 @@
                 <w:sz w:val="18"/>
                 <w:szCs w:val="18"/>
               </w:rPr>
-              <w:t xml:space="preserve">Active development milestone: new server migration, Excel-based metadata management, and API Tester Menu are all in progress.</w:t>
+              <w:t xml:space="preserve">Two WiBillPay milestones completed: Gongju Bank avatar attendance integration (01/26) and attendance icon design update (02/20).</w:t>
             </w:r>
           </w:p>
         </w:tc>
@@ -11823,7 +13712,7 @@
                 <w:sz w:val="18"/>
                 <w:szCs w:val="18"/>
               </w:rPr>
-              <w:t xml:space="preserve">Scraping Team</w:t>
+              <w:t xml:space="preserve">COOCON – PDSM &amp; CooconProxy</w:t>
             </w:r>
           </w:p>
         </w:tc>
@@ -11853,7 +13742,71 @@
                 <w:sz w:val="18"/>
                 <w:szCs w:val="18"/>
               </w:rPr>
-              <w:t xml:space="preserve">No activity reported this week. Team utilization and task pipeline to be reviewed.</w:t>
+              <w:t xml:space="preserve">Public My Data (PDSM) development is on track as a key Q1 milestone. CooconProxy Admin is targeting Q2 2026 (within 3 months).</w:t>
+            </w:r>
+          </w:p>
+        </w:tc>
+      </w:tr>
+      <w:tr>
+        <w:tc>
+          <w:tcPr>
+            <w:tcW w:type="dxa" w:w="4500"/>
+            <w:tcBorders>
+              <w:top w:val="single" w:color="AAAAAA" w:sz="1"/>
+              <w:left w:val="single" w:color="AAAAAA" w:sz="1"/>
+              <w:bottom w:val="single" w:color="AAAAAA" w:sz="1"/>
+              <w:right w:val="single" w:color="AAAAAA" w:sz="1"/>
+            </w:tcBorders>
+            <w:shd w:fill="1F3864" w:val="clear"/>
+            <w:tcMar>
+              <w:top w:type="dxa" w:w="100"/>
+              <w:left w:type="dxa" w:w="140"/>
+              <w:bottom w:type="dxa" w:w="100"/>
+              <w:right w:type="dxa" w:w="140"/>
+            </w:tcMar>
+            <w:vAlign w:val="center"/>
+          </w:tcPr>
+          <w:p>
+            <w:r>
+              <w:rPr>
+                <w:rFonts w:ascii="Arial" w:cs="Arial" w:eastAsia="Arial" w:hAnsi="Arial"/>
+                <w:b/>
+                <w:bCs/>
+                <w:color w:val="FFFFFF"/>
+                <w:sz w:val="18"/>
+                <w:szCs w:val="18"/>
+              </w:rPr>
+              <w:t xml:space="preserve">Scraping Team</w:t>
+            </w:r>
+          </w:p>
+        </w:tc>
+        <w:tc>
+          <w:tcPr>
+            <w:tcW w:type="dxa" w:w="10898"/>
+            <w:tcBorders>
+              <w:top w:val="single" w:color="AAAAAA" w:sz="1"/>
+              <w:left w:val="single" w:color="AAAAAA" w:sz="1"/>
+              <w:bottom w:val="single" w:color="AAAAAA" w:sz="1"/>
+              <w:right w:val="single" w:color="AAAAAA" w:sz="1"/>
+            </w:tcBorders>
+            <w:shd w:fill="FFFFFF" w:val="clear"/>
+            <w:tcMar>
+              <w:top w:type="dxa" w:w="100"/>
+              <w:left w:type="dxa" w:w="140"/>
+              <w:bottom w:type="dxa" w:w="100"/>
+              <w:right w:type="dxa" w:w="140"/>
+            </w:tcMar>
+            <w:vAlign w:val="center"/>
+          </w:tcPr>
+          <w:p>
+            <w:r>
+              <w:rPr>
+                <w:rFonts w:ascii="Arial" w:cs="Arial" w:eastAsia="Arial" w:hAnsi="Arial"/>
+                <w:color w:val="595959"/>
+                <w:sz w:val="18"/>
+                <w:szCs w:val="18"/>
+              </w:rPr>
+              <w:t xml:space="preserve">No activity reported this week. Team pipeline and utilization to be reviewed in next cycle.</w:t>
             </w:r>
           </w:p>
         </w:tc>

</xml_diff>